<commit_message>
Roteiro Roberto Müller: revisão final da parte 5
Co-Authored-By: Claude Opus 5.5 <noreply@anthropic.com>
Claude-Session: https://claude.ai/code/session_01MJjUEEZrxQDEUifKK2vj9g
</commit_message>
<xml_diff>
--- a/roteiros/roberto-muller/RobertoMuller_Parte5_Final.docx
+++ b/roteiros/roberto-muller/RobertoMuller_Parte5_Final.docx
@@ -79,7 +79,7 @@
         <w:rPr>
           <w:color w:val="C00000"/>
         </w:rPr>
-        <w:t>Onze dias. Guarde esse número, porque foi o tempo que separou a entrada de Roberto Müller no hospital do último capítulo da vida dele. E o que aconteceu no fim desses onze dias fecha a história que começou com aquele livro de dois mil e dois.</w:t>
+        <w:t>Onze dias. Anote esse número, porque foi o tempo que separou a entrada de Roberto Müller no hospital do último capítulo da vida dele. E o que aconteceu no fim desses onze dias fecha a história que começou com aquele livro de dois mil e dois.</w:t>
       </w:r>
     </w:p>
     <w:p>
@@ -111,7 +111,7 @@
         <w:rPr>
           <w:color w:val="000000"/>
         </w:rPr>
-        <w:t>Imagine a cena de um quarto de hospital com um homem de oitenta e nove anos deitado, ligado a aparelhos. Ao lado dele, alguém que conhece de cor cada música que ele gravou. Alguém que talvez cantasse baixinho "Entre Espumas" para ele, como tantas vezes ele cantou para os outros.</w:t>
+        <w:t>Imagine a cena de um quarto de hospital com um homem de oitenta e nove anos deitado. Ao lado dele, alguém que conhece de cor cada música que ele gravou. Alguém que talvez cantasse baixinho "Entre Espumas" para ele, como tantas vezes ele cantou para os outros.</w:t>
       </w:r>
     </w:p>
     <w:p>
@@ -127,7 +127,7 @@
         <w:rPr>
           <w:color w:val="C00000"/>
         </w:rPr>
-        <w:t>E sabemos também o que faltou. Porque, enquanto Roberto Müller vivia os últimos dias num hospital do Recife, o país que um dia o aplaudiu seguia sem saber de nada.</w:t>
+        <w:t>E sabemos também o que faltou. Porque, enquanto Roberto Müller vivia os últimos dias num hospital do Recife, o Brasil lá fora seguia sem saber de nada.</w:t>
       </w:r>
     </w:p>
     <w:p>
@@ -343,7 +343,7 @@
         <w:rPr>
           <w:color w:val="000000"/>
         </w:rPr>
-        <w:t>Nas primeiras quinze horas depois da morte, segundo a própria busca do YouTube, o vídeo mais assistido sobre o assunto no YouTube tinha pouco mais de trinta mil visualizações.</w:t>
+        <w:t>Nas primeiras quinze horas depois da morte, segundo a própria busca da plataforma, o vídeo mais assistido sobre o assunto no YouTube tinha pouco mais de trinta mil visualizações.</w:t>
       </w:r>
     </w:p>
     <w:p>
@@ -359,7 +359,7 @@
         <w:rPr>
           <w:color w:val="000000"/>
         </w:rPr>
-        <w:t>A mesma internet que ouviu "Entre Espumas" quase sete milhões de vezes quase não parou para saber que o dono daquela voz tinha morrido.</w:t>
+        <w:t>A mesma internet que ouviu "Entre Espumas" perto de sete milhões de vezes quase não parou para saber que o dono daquela voz tinha morrido.</w:t>
       </w:r>
     </w:p>
     <w:p>
@@ -503,7 +503,7 @@
         <w:rPr>
           <w:color w:val="000000"/>
         </w:rPr>
-        <w:t>Lembra que eu disse que a frase daquele livro de dois mil e dois não terminava em "morreu ainda jovem"?</w:t>
+        <w:t>Eu te disse que a frase daquele livro de dois mil e dois não terminava em "morreu ainda jovem".</w:t>
       </w:r>
     </w:p>
     <w:p>
@@ -567,7 +567,7 @@
         <w:rPr>
           <w:color w:val="000000"/>
         </w:rPr>
-        <w:t>Quando aquela frase foi escrita, Roberto Müller estava vivo. E ninguém lembrava dele com carinho. Lembravam tão pouco que o próprio governo achou que ele tinha morrido.</w:t>
+        <w:t>Quando aquela frase foi escrita, Roberto Müller estava vivo. E o país, que deveria lembrar dele com carinho, lembrava tão pouco que o próprio governo achou que ele tinha morrido.</w:t>
       </w:r>
     </w:p>
     <w:p>
@@ -615,7 +615,7 @@
         <w:rPr>
           <w:color w:val="000000"/>
         </w:rPr>
-        <w:t>E foi só quando Roberto Müller morreu de verdade que ela finalmente se tornou verdadeira.</w:t>
+        <w:t>Os fãs mais fiéis guardaram os discos e os DVDs. O resto do país seguiu em frente.</w:t>
       </w:r>
     </w:p>
     <w:p>
@@ -623,7 +623,7 @@
         <w:rPr>
           <w:color w:val="000000"/>
         </w:rPr>
-        <w:t>Nas homenagens da prefeitura. Nos portais do Nordeste. Nos comentários de fãs se despedindo do Pingo de Ouro.</w:t>
+        <w:t>E foi só quando Roberto Müller morreu de verdade que a frase começou a se cumprir. Mesmo pequena, a lembrança veio, na nota da prefeitura e nos portais do Nordeste.</w:t>
       </w:r>
     </w:p>
     <w:p>
@@ -631,7 +631,7 @@
         <w:rPr>
           <w:color w:val="000000"/>
         </w:rPr>
-        <w:t>Só depois de morto ele passou a ser lembrado com carinho.</w:t>
+        <w:t>Só depois de morto o Brasil voltou a falar dele com carinho. Tarde demais para ele ouvir.</w:t>
       </w:r>
     </w:p>
     <w:p>
@@ -687,7 +687,7 @@
         <w:rPr>
           <w:color w:val="000000"/>
         </w:rPr>
-        <w:t>E, em alguma rádio do interior do Nordeste, numa madrugada qualquer, "Entre Espumas" ainda vai tocar. Alguém vai aumentar o volume. Alguém vai cantar junto, de olhos fechados, sem saber que o homem por trás daquela voz passou os últimos anos numa cama, com menos de dois salários mínimos, longe dos olhos do país que um dia o aplaudiu.</w:t>
+        <w:t>E, em alguma rádio do interior do Nordeste, numa madrugada qualquer, "Entre Espumas" ainda vai tocar. Alguém vai aumentar o volume. Alguém vai cantar junto, de olhos fechados, sem saber que o homem por trás daquela voz passou os últimos anos numa cama, com menos de dois salários mínimos, longe dos olhos do Brasil.</w:t>
       </w:r>
     </w:p>
     <w:p>

</xml_diff>